<commit_message>
Materiais: dado pessoal removido, estratificações, condutas e ata de reunião
- Termo de indicação de gestor/fiscal virou modelo em branco (tinha servidoras e matrículas)
- AVS e relatório de viagem sem CPF, conta e matrícula; estratificação de saúde mental sem a paciente
- Nomes de autor tirados das propriedades de todos os .docx/.xls/.xlsx
- Categorias novas: Estratificações de risco, Condutas clínicas
- Modelo de Ata de reunião com lista de presença e assinaturas

Co-Authored-By: Claude Opus 5.5 <noreply@anthropic.com>
</commit_message>
<xml_diff>
--- a/MATERIAIS PUBLICADOS/ANEXOS ADMINISTRATIVO/Anexo IV - Solicitação de consertos.docx
+++ b/MATERIAIS PUBLICADOS/ANEXOS ADMINISTRATIVO/Anexo IV - Solicitação de consertos.docx
@@ -1,6 +1,6 @@
 
 <file path=word/document.xml><?xml version="1.0" encoding="utf-8"?>
-<w:document xmlns:wpc="http://schemas.microsoft.com/office/word/2010/wordprocessingCanvas" xmlns:cx="http://schemas.microsoft.com/office/drawing/2014/chartex" xmlns:cx1="http://schemas.microsoft.com/office/drawing/2015/9/8/chartex" xmlns:cx2="http://schemas.microsoft.com/office/drawing/2015/10/21/chartex" xmlns:cx3="http://schemas.microsoft.com/office/drawing/2016/5/9/chartex" xmlns:cx4="http://schemas.microsoft.com/office/drawing/2016/5/10/chartex" xmlns:cx5="http://schemas.microsoft.com/office/drawing/2016/5/11/chartex" xmlns:cx6="http://schemas.microsoft.com/office/drawing/2016/5/12/chartex" xmlns:cx7="http://schemas.microsoft.com/office/drawing/2016/5/13/chartex" xmlns:cx8="http://schemas.microsoft.com/office/drawing/2016/5/14/chartex" xmlns:mc="http://schemas.openxmlformats.org/markup-compatibility/2006" xmlns:aink="http://schemas.microsoft.com/office/drawing/2016/ink" xmlns:am3d="http://schemas.microsoft.com/office/drawing/2017/model3d" xmlns:o="urn:schemas-microsoft-com:office:office" xmlns:r="http://schemas.openxmlformats.org/officeDocument/2006/relationships" xmlns:m="http://schemas.openxmlformats.org/officeDocument/2006/math" xmlns:v="urn:schemas-microsoft-com:vml" xmlns:wp14="http://schemas.microsoft.com/office/word/2010/wordprocessingDrawing" xmlns:wp="http://schemas.openxmlformats.org/drawingml/2006/wordprocessingDrawing" xmlns:w10="urn:schemas-microsoft-com:office:word" xmlns:w="http://schemas.openxmlformats.org/wordprocessingml/2006/main" xmlns:w14="http://schemas.microsoft.com/office/word/2010/wordml" xmlns:w15="http://schemas.microsoft.com/office/word/2012/wordml" xmlns:w16cex="http://schemas.microsoft.com/office/word/2018/wordml/cex" xmlns:w16cid="http://schemas.microsoft.com/office/word/2016/wordml/cid" xmlns:w16="http://schemas.microsoft.com/office/word/2018/wordml" xmlns:w16sdtdh="http://schemas.microsoft.com/office/word/2020/wordml/sdtdatahash" xmlns:w16se="http://schemas.microsoft.com/office/word/2015/wordml/symex" xmlns:wpg="http://schemas.microsoft.com/office/word/2010/wordprocessingGroup" xmlns:wpi="http://schemas.microsoft.com/office/word/2010/wordprocessingInk" xmlns:wne="http://schemas.microsoft.com/office/word/2006/wordml" xmlns:wps="http://schemas.microsoft.com/office/word/2010/wordprocessingShape" mc:Ignorable="w14 w15 w16se w16cid w16 w16cex w16sdtdh wp14">
+<w:document xmlns:wpc="http://schemas.microsoft.com/office/word/2010/wordprocessingCanvas" xmlns:cx="http://schemas.microsoft.com/office/drawing/2014/chartex" xmlns:cx1="http://schemas.microsoft.com/office/drawing/2015/9/8/chartex" xmlns:cx2="http://schemas.microsoft.com/office/drawing/2015/10/21/chartex" xmlns:cx3="http://schemas.microsoft.com/office/drawing/2016/5/9/chartex" xmlns:cx4="http://schemas.microsoft.com/office/drawing/2016/5/10/chartex" xmlns:cx5="http://schemas.microsoft.com/office/drawing/2016/5/11/chartex" xmlns:cx6="http://schemas.microsoft.com/office/drawing/2016/5/12/chartex" xmlns:cx7="http://schemas.microsoft.com/office/drawing/2016/5/13/chartex" xmlns:cx8="http://schemas.microsoft.com/office/drawing/2016/5/14/chartex" xmlns:mc="http://schemas.openxmlformats.org/markup-compatibility/2006" xmlns:aink="http://schemas.microsoft.com/office/drawing/2016/ink" xmlns:am3d="http://schemas.microsoft.com/office/drawing/2017/model3d" xmlns:o="urn:schemas-microsoft-com:office:office" xmlns:oel="http://schemas.microsoft.com/office/2019/extlst" xmlns:r="http://schemas.openxmlformats.org/officeDocument/2006/relationships" xmlns:m="http://schemas.openxmlformats.org/officeDocument/2006/math" xmlns:v="urn:schemas-microsoft-com:vml" xmlns:wp14="http://schemas.microsoft.com/office/word/2010/wordprocessingDrawing" xmlns:wp="http://schemas.openxmlformats.org/drawingml/2006/wordprocessingDrawing" xmlns:w10="urn:schemas-microsoft-com:office:word" xmlns:w="http://schemas.openxmlformats.org/wordprocessingml/2006/main" xmlns:w14="http://schemas.microsoft.com/office/word/2010/wordml" xmlns:w15="http://schemas.microsoft.com/office/word/2012/wordml" xmlns:w16cex="http://schemas.microsoft.com/office/word/2018/wordml/cex" xmlns:w16cid="http://schemas.microsoft.com/office/word/2016/wordml/cid" xmlns:w16="http://schemas.microsoft.com/office/word/2018/wordml" xmlns:w16du="http://schemas.microsoft.com/office/word/2023/wordml/word16du" xmlns:w16sdtdh="http://schemas.microsoft.com/office/word/2020/wordml/sdtdatahash" xmlns:w16sdtfl="http://schemas.microsoft.com/office/word/2024/wordml/sdtformatlock" xmlns:w16se="http://schemas.microsoft.com/office/word/2015/wordml/symex" xmlns:wpg="http://schemas.microsoft.com/office/word/2010/wordprocessingGroup" xmlns:wpi="http://schemas.microsoft.com/office/word/2010/wordprocessingInk" xmlns:wne="http://schemas.microsoft.com/office/word/2006/wordml" xmlns:wps="http://schemas.microsoft.com/office/word/2010/wordprocessingShape" mc:Ignorable="w14 w15 w16se w16cid w16 w16cex w16sdtdh w16sdtfl w16du wp14">
   <w:body>
     <w:p>
       <w:pPr>
@@ -17,7 +17,6 @@
         </w:rPr>
         <w:t xml:space="preserve">Memorando </w:t>
       </w:r>
-      <w:proofErr w:type="spellStart"/>
       <w:r>
         <w:rPr>
           <w:rFonts w:eastAsia="Calibri"/>
@@ -30,15 +29,7 @@
           <w:rFonts w:eastAsia="Calibri"/>
           <w:lang w:eastAsia="en-US"/>
         </w:rPr>
-        <w:t>xxx</w:t>
-      </w:r>
-      <w:proofErr w:type="spellEnd"/>
-      <w:r>
-        <w:rPr>
-          <w:rFonts w:eastAsia="Calibri"/>
-          <w:lang w:eastAsia="en-US"/>
-        </w:rPr>
-        <w:t>/2025</w:t>
+        <w:t>xxx/2025</w:t>
       </w:r>
       <w:r>
         <w:rPr>
@@ -192,7 +183,7 @@
 </file>
 
 <file path=word/endnotes.xml><?xml version="1.0" encoding="utf-8"?>
-<w:endnotes xmlns:wpc="http://schemas.microsoft.com/office/word/2010/wordprocessingCanvas" xmlns:cx="http://schemas.microsoft.com/office/drawing/2014/chartex" xmlns:cx1="http://schemas.microsoft.com/office/drawing/2015/9/8/chartex" xmlns:cx2="http://schemas.microsoft.com/office/drawing/2015/10/21/chartex" xmlns:cx3="http://schemas.microsoft.com/office/drawing/2016/5/9/chartex" xmlns:cx4="http://schemas.microsoft.com/office/drawing/2016/5/10/chartex" xmlns:cx5="http://schemas.microsoft.com/office/drawing/2016/5/11/chartex" xmlns:cx6="http://schemas.microsoft.com/office/drawing/2016/5/12/chartex" xmlns:cx7="http://schemas.microsoft.com/office/drawing/2016/5/13/chartex" xmlns:cx8="http://schemas.microsoft.com/office/drawing/2016/5/14/chartex" xmlns:mc="http://schemas.openxmlformats.org/markup-compatibility/2006" xmlns:aink="http://schemas.microsoft.com/office/drawing/2016/ink" xmlns:am3d="http://schemas.microsoft.com/office/drawing/2017/model3d" xmlns:o="urn:schemas-microsoft-com:office:office" xmlns:r="http://schemas.openxmlformats.org/officeDocument/2006/relationships" xmlns:m="http://schemas.openxmlformats.org/officeDocument/2006/math" xmlns:v="urn:schemas-microsoft-com:vml" xmlns:wp14="http://schemas.microsoft.com/office/word/2010/wordprocessingDrawing" xmlns:wp="http://schemas.openxmlformats.org/drawingml/2006/wordprocessingDrawing" xmlns:w10="urn:schemas-microsoft-com:office:word" xmlns:w="http://schemas.openxmlformats.org/wordprocessingml/2006/main" xmlns:w14="http://schemas.microsoft.com/office/word/2010/wordml" xmlns:w15="http://schemas.microsoft.com/office/word/2012/wordml" xmlns:w16cex="http://schemas.microsoft.com/office/word/2018/wordml/cex" xmlns:w16cid="http://schemas.microsoft.com/office/word/2016/wordml/cid" xmlns:w16="http://schemas.microsoft.com/office/word/2018/wordml" xmlns:w16sdtdh="http://schemas.microsoft.com/office/word/2020/wordml/sdtdatahash" xmlns:w16se="http://schemas.microsoft.com/office/word/2015/wordml/symex" xmlns:wpg="http://schemas.microsoft.com/office/word/2010/wordprocessingGroup" xmlns:wpi="http://schemas.microsoft.com/office/word/2010/wordprocessingInk" xmlns:wne="http://schemas.microsoft.com/office/word/2006/wordml" xmlns:wps="http://schemas.microsoft.com/office/word/2010/wordprocessingShape" mc:Ignorable="w14 w15 w16se w16cid w16 w16cex w16sdtdh wp14">
+<w:endnotes xmlns:wpc="http://schemas.microsoft.com/office/word/2010/wordprocessingCanvas" xmlns:cx="http://schemas.microsoft.com/office/drawing/2014/chartex" xmlns:cx1="http://schemas.microsoft.com/office/drawing/2015/9/8/chartex" xmlns:cx2="http://schemas.microsoft.com/office/drawing/2015/10/21/chartex" xmlns:cx3="http://schemas.microsoft.com/office/drawing/2016/5/9/chartex" xmlns:cx4="http://schemas.microsoft.com/office/drawing/2016/5/10/chartex" xmlns:cx5="http://schemas.microsoft.com/office/drawing/2016/5/11/chartex" xmlns:cx6="http://schemas.microsoft.com/office/drawing/2016/5/12/chartex" xmlns:cx7="http://schemas.microsoft.com/office/drawing/2016/5/13/chartex" xmlns:cx8="http://schemas.microsoft.com/office/drawing/2016/5/14/chartex" xmlns:mc="http://schemas.openxmlformats.org/markup-compatibility/2006" xmlns:aink="http://schemas.microsoft.com/office/drawing/2016/ink" xmlns:am3d="http://schemas.microsoft.com/office/drawing/2017/model3d" xmlns:o="urn:schemas-microsoft-com:office:office" xmlns:oel="http://schemas.microsoft.com/office/2019/extlst" xmlns:r="http://schemas.openxmlformats.org/officeDocument/2006/relationships" xmlns:m="http://schemas.openxmlformats.org/officeDocument/2006/math" xmlns:v="urn:schemas-microsoft-com:vml" xmlns:wp14="http://schemas.microsoft.com/office/word/2010/wordprocessingDrawing" xmlns:wp="http://schemas.openxmlformats.org/drawingml/2006/wordprocessingDrawing" xmlns:w10="urn:schemas-microsoft-com:office:word" xmlns:w="http://schemas.openxmlformats.org/wordprocessingml/2006/main" xmlns:w14="http://schemas.microsoft.com/office/word/2010/wordml" xmlns:w15="http://schemas.microsoft.com/office/word/2012/wordml" xmlns:w16cex="http://schemas.microsoft.com/office/word/2018/wordml/cex" xmlns:w16cid="http://schemas.microsoft.com/office/word/2016/wordml/cid" xmlns:w16="http://schemas.microsoft.com/office/word/2018/wordml" xmlns:w16du="http://schemas.microsoft.com/office/word/2023/wordml/word16du" xmlns:w16sdtdh="http://schemas.microsoft.com/office/word/2020/wordml/sdtdatahash" xmlns:w16sdtfl="http://schemas.microsoft.com/office/word/2024/wordml/sdtformatlock" xmlns:w16se="http://schemas.microsoft.com/office/word/2015/wordml/symex" xmlns:wpg="http://schemas.microsoft.com/office/word/2010/wordprocessingGroup" xmlns:wpi="http://schemas.microsoft.com/office/word/2010/wordprocessingInk" xmlns:wne="http://schemas.microsoft.com/office/word/2006/wordml" xmlns:wps="http://schemas.microsoft.com/office/word/2010/wordprocessingShape" mc:Ignorable="w14 w15 w16se w16cid w16 w16cex w16sdtdh w16sdtfl w16du wp14">
   <w:endnote w:type="separator" w:id="-1">
     <w:p>
       <w:r>
@@ -211,7 +202,7 @@
 </file>
 
 <file path=word/footer1.xml><?xml version="1.0" encoding="utf-8"?>
-<w:ftr xmlns:wpc="http://schemas.microsoft.com/office/word/2010/wordprocessingCanvas" xmlns:cx="http://schemas.microsoft.com/office/drawing/2014/chartex" xmlns:cx1="http://schemas.microsoft.com/office/drawing/2015/9/8/chartex" xmlns:cx2="http://schemas.microsoft.com/office/drawing/2015/10/21/chartex" xmlns:cx3="http://schemas.microsoft.com/office/drawing/2016/5/9/chartex" xmlns:cx4="http://schemas.microsoft.com/office/drawing/2016/5/10/chartex" xmlns:cx5="http://schemas.microsoft.com/office/drawing/2016/5/11/chartex" xmlns:cx6="http://schemas.microsoft.com/office/drawing/2016/5/12/chartex" xmlns:cx7="http://schemas.microsoft.com/office/drawing/2016/5/13/chartex" xmlns:cx8="http://schemas.microsoft.com/office/drawing/2016/5/14/chartex" xmlns:mc="http://schemas.openxmlformats.org/markup-compatibility/2006" xmlns:aink="http://schemas.microsoft.com/office/drawing/2016/ink" xmlns:am3d="http://schemas.microsoft.com/office/drawing/2017/model3d" xmlns:o="urn:schemas-microsoft-com:office:office" xmlns:r="http://schemas.openxmlformats.org/officeDocument/2006/relationships" xmlns:m="http://schemas.openxmlformats.org/officeDocument/2006/math" xmlns:v="urn:schemas-microsoft-com:vml" xmlns:wp14="http://schemas.microsoft.com/office/word/2010/wordprocessingDrawing" xmlns:wp="http://schemas.openxmlformats.org/drawingml/2006/wordprocessingDrawing" xmlns:w10="urn:schemas-microsoft-com:office:word" xmlns:w="http://schemas.openxmlformats.org/wordprocessingml/2006/main" xmlns:w14="http://schemas.microsoft.com/office/word/2010/wordml" xmlns:w15="http://schemas.microsoft.com/office/word/2012/wordml" xmlns:w16cex="http://schemas.microsoft.com/office/word/2018/wordml/cex" xmlns:w16cid="http://schemas.microsoft.com/office/word/2016/wordml/cid" xmlns:w16="http://schemas.microsoft.com/office/word/2018/wordml" xmlns:w16sdtdh="http://schemas.microsoft.com/office/word/2020/wordml/sdtdatahash" xmlns:w16se="http://schemas.microsoft.com/office/word/2015/wordml/symex" xmlns:wpg="http://schemas.microsoft.com/office/word/2010/wordprocessingGroup" xmlns:wpi="http://schemas.microsoft.com/office/word/2010/wordprocessingInk" xmlns:wne="http://schemas.microsoft.com/office/word/2006/wordml" xmlns:wps="http://schemas.microsoft.com/office/word/2010/wordprocessingShape" mc:Ignorable="w14 w15 w16se w16cid w16 w16cex w16sdtdh wp14">
+<w:ftr xmlns:wpc="http://schemas.microsoft.com/office/word/2010/wordprocessingCanvas" xmlns:cx="http://schemas.microsoft.com/office/drawing/2014/chartex" xmlns:cx1="http://schemas.microsoft.com/office/drawing/2015/9/8/chartex" xmlns:cx2="http://schemas.microsoft.com/office/drawing/2015/10/21/chartex" xmlns:cx3="http://schemas.microsoft.com/office/drawing/2016/5/9/chartex" xmlns:cx4="http://schemas.microsoft.com/office/drawing/2016/5/10/chartex" xmlns:cx5="http://schemas.microsoft.com/office/drawing/2016/5/11/chartex" xmlns:cx6="http://schemas.microsoft.com/office/drawing/2016/5/12/chartex" xmlns:cx7="http://schemas.microsoft.com/office/drawing/2016/5/13/chartex" xmlns:cx8="http://schemas.microsoft.com/office/drawing/2016/5/14/chartex" xmlns:mc="http://schemas.openxmlformats.org/markup-compatibility/2006" xmlns:aink="http://schemas.microsoft.com/office/drawing/2016/ink" xmlns:am3d="http://schemas.microsoft.com/office/drawing/2017/model3d" xmlns:o="urn:schemas-microsoft-com:office:office" xmlns:oel="http://schemas.microsoft.com/office/2019/extlst" xmlns:r="http://schemas.openxmlformats.org/officeDocument/2006/relationships" xmlns:m="http://schemas.openxmlformats.org/officeDocument/2006/math" xmlns:v="urn:schemas-microsoft-com:vml" xmlns:wp14="http://schemas.microsoft.com/office/word/2010/wordprocessingDrawing" xmlns:wp="http://schemas.openxmlformats.org/drawingml/2006/wordprocessingDrawing" xmlns:w10="urn:schemas-microsoft-com:office:word" xmlns:w="http://schemas.openxmlformats.org/wordprocessingml/2006/main" xmlns:w14="http://schemas.microsoft.com/office/word/2010/wordml" xmlns:w15="http://schemas.microsoft.com/office/word/2012/wordml" xmlns:w16cex="http://schemas.microsoft.com/office/word/2018/wordml/cex" xmlns:w16cid="http://schemas.microsoft.com/office/word/2016/wordml/cid" xmlns:w16="http://schemas.microsoft.com/office/word/2018/wordml" xmlns:w16du="http://schemas.microsoft.com/office/word/2023/wordml/word16du" xmlns:w16sdtdh="http://schemas.microsoft.com/office/word/2020/wordml/sdtdatahash" xmlns:w16sdtfl="http://schemas.microsoft.com/office/word/2024/wordml/sdtformatlock" xmlns:w16se="http://schemas.microsoft.com/office/word/2015/wordml/symex" xmlns:wpg="http://schemas.microsoft.com/office/word/2010/wordprocessingGroup" xmlns:wpi="http://schemas.microsoft.com/office/word/2010/wordprocessingInk" xmlns:wne="http://schemas.microsoft.com/office/word/2006/wordml" xmlns:wps="http://schemas.microsoft.com/office/word/2010/wordprocessingShape" mc:Ignorable="w14 w15 w16se w16cid w16 w16cex w16sdtdh w16sdtfl w16du wp14">
   <w:p>
     <w:pPr>
       <w:pStyle w:val="Rodap"/>
@@ -317,16 +308,15 @@
         <w:sz w:val="20"/>
         <w:szCs w:val="20"/>
       </w:rPr>
-      <w:t xml:space="preserve"> DE SÃO MATEUS DO </w:t>
+      <w:t xml:space="preserve"> DE SÃO MATEUS DO SUL</w:t>
     </w:r>
-    <w:proofErr w:type="gramStart"/>
     <w:r>
       <w:rPr>
         <w:rFonts w:ascii="Montserrat" w:hAnsi="Montserrat"/>
         <w:sz w:val="20"/>
         <w:szCs w:val="20"/>
       </w:rPr>
-      <w:t>SUL</w:t>
+      <w:t xml:space="preserve"> </w:t>
     </w:r>
     <w:r>
       <w:rPr>
@@ -342,24 +332,7 @@
         <w:sz w:val="20"/>
         <w:szCs w:val="20"/>
       </w:rPr>
-      <w:t xml:space="preserve"> </w:t>
-    </w:r>
-    <w:r>
-      <w:rPr>
-        <w:rFonts w:ascii="Montserrat" w:hAnsi="Montserrat"/>
-        <w:sz w:val="20"/>
-        <w:szCs w:val="20"/>
-      </w:rPr>
-      <w:t>/</w:t>
-    </w:r>
-    <w:proofErr w:type="gramEnd"/>
-    <w:r>
-      <w:rPr>
-        <w:rFonts w:ascii="Montserrat" w:hAnsi="Montserrat"/>
-        <w:sz w:val="20"/>
-        <w:szCs w:val="20"/>
-      </w:rPr>
-      <w:t xml:space="preserve"> </w:t>
+      <w:t xml:space="preserve">/ </w:t>
     </w:r>
     <w:r>
       <w:rPr>
@@ -436,7 +409,7 @@
 </file>
 
 <file path=word/footnotes.xml><?xml version="1.0" encoding="utf-8"?>
-<w:footnotes xmlns:wpc="http://schemas.microsoft.com/office/word/2010/wordprocessingCanvas" xmlns:cx="http://schemas.microsoft.com/office/drawing/2014/chartex" xmlns:cx1="http://schemas.microsoft.com/office/drawing/2015/9/8/chartex" xmlns:cx2="http://schemas.microsoft.com/office/drawing/2015/10/21/chartex" xmlns:cx3="http://schemas.microsoft.com/office/drawing/2016/5/9/chartex" xmlns:cx4="http://schemas.microsoft.com/office/drawing/2016/5/10/chartex" xmlns:cx5="http://schemas.microsoft.com/office/drawing/2016/5/11/chartex" xmlns:cx6="http://schemas.microsoft.com/office/drawing/2016/5/12/chartex" xmlns:cx7="http://schemas.microsoft.com/office/drawing/2016/5/13/chartex" xmlns:cx8="http://schemas.microsoft.com/office/drawing/2016/5/14/chartex" xmlns:mc="http://schemas.openxmlformats.org/markup-compatibility/2006" xmlns:aink="http://schemas.microsoft.com/office/drawing/2016/ink" xmlns:am3d="http://schemas.microsoft.com/office/drawing/2017/model3d" xmlns:o="urn:schemas-microsoft-com:office:office" xmlns:r="http://schemas.openxmlformats.org/officeDocument/2006/relationships" xmlns:m="http://schemas.openxmlformats.org/officeDocument/2006/math" xmlns:v="urn:schemas-microsoft-com:vml" xmlns:wp14="http://schemas.microsoft.com/office/word/2010/wordprocessingDrawing" xmlns:wp="http://schemas.openxmlformats.org/drawingml/2006/wordprocessingDrawing" xmlns:w10="urn:schemas-microsoft-com:office:word" xmlns:w="http://schemas.openxmlformats.org/wordprocessingml/2006/main" xmlns:w14="http://schemas.microsoft.com/office/word/2010/wordml" xmlns:w15="http://schemas.microsoft.com/office/word/2012/wordml" xmlns:w16cex="http://schemas.microsoft.com/office/word/2018/wordml/cex" xmlns:w16cid="http://schemas.microsoft.com/office/word/2016/wordml/cid" xmlns:w16="http://schemas.microsoft.com/office/word/2018/wordml" xmlns:w16sdtdh="http://schemas.microsoft.com/office/word/2020/wordml/sdtdatahash" xmlns:w16se="http://schemas.microsoft.com/office/word/2015/wordml/symex" xmlns:wpg="http://schemas.microsoft.com/office/word/2010/wordprocessingGroup" xmlns:wpi="http://schemas.microsoft.com/office/word/2010/wordprocessingInk" xmlns:wne="http://schemas.microsoft.com/office/word/2006/wordml" xmlns:wps="http://schemas.microsoft.com/office/word/2010/wordprocessingShape" mc:Ignorable="w14 w15 w16se w16cid w16 w16cex w16sdtdh wp14">
+<w:footnotes xmlns:wpc="http://schemas.microsoft.com/office/word/2010/wordprocessingCanvas" xmlns:cx="http://schemas.microsoft.com/office/drawing/2014/chartex" xmlns:cx1="http://schemas.microsoft.com/office/drawing/2015/9/8/chartex" xmlns:cx2="http://schemas.microsoft.com/office/drawing/2015/10/21/chartex" xmlns:cx3="http://schemas.microsoft.com/office/drawing/2016/5/9/chartex" xmlns:cx4="http://schemas.microsoft.com/office/drawing/2016/5/10/chartex" xmlns:cx5="http://schemas.microsoft.com/office/drawing/2016/5/11/chartex" xmlns:cx6="http://schemas.microsoft.com/office/drawing/2016/5/12/chartex" xmlns:cx7="http://schemas.microsoft.com/office/drawing/2016/5/13/chartex" xmlns:cx8="http://schemas.microsoft.com/office/drawing/2016/5/14/chartex" xmlns:mc="http://schemas.openxmlformats.org/markup-compatibility/2006" xmlns:aink="http://schemas.microsoft.com/office/drawing/2016/ink" xmlns:am3d="http://schemas.microsoft.com/office/drawing/2017/model3d" xmlns:o="urn:schemas-microsoft-com:office:office" xmlns:oel="http://schemas.microsoft.com/office/2019/extlst" xmlns:r="http://schemas.openxmlformats.org/officeDocument/2006/relationships" xmlns:m="http://schemas.openxmlformats.org/officeDocument/2006/math" xmlns:v="urn:schemas-microsoft-com:vml" xmlns:wp14="http://schemas.microsoft.com/office/word/2010/wordprocessingDrawing" xmlns:wp="http://schemas.openxmlformats.org/drawingml/2006/wordprocessingDrawing" xmlns:w10="urn:schemas-microsoft-com:office:word" xmlns:w="http://schemas.openxmlformats.org/wordprocessingml/2006/main" xmlns:w14="http://schemas.microsoft.com/office/word/2010/wordml" xmlns:w15="http://schemas.microsoft.com/office/word/2012/wordml" xmlns:w16cex="http://schemas.microsoft.com/office/word/2018/wordml/cex" xmlns:w16cid="http://schemas.microsoft.com/office/word/2016/wordml/cid" xmlns:w16="http://schemas.microsoft.com/office/word/2018/wordml" xmlns:w16du="http://schemas.microsoft.com/office/word/2023/wordml/word16du" xmlns:w16sdtdh="http://schemas.microsoft.com/office/word/2020/wordml/sdtdatahash" xmlns:w16sdtfl="http://schemas.microsoft.com/office/word/2024/wordml/sdtformatlock" xmlns:w16se="http://schemas.microsoft.com/office/word/2015/wordml/symex" xmlns:wpg="http://schemas.microsoft.com/office/word/2010/wordprocessingGroup" xmlns:wpi="http://schemas.microsoft.com/office/word/2010/wordprocessingInk" xmlns:wne="http://schemas.microsoft.com/office/word/2006/wordml" xmlns:wps="http://schemas.microsoft.com/office/word/2010/wordprocessingShape" mc:Ignorable="w14 w15 w16se w16cid w16 w16cex w16sdtdh w16sdtfl w16du wp14">
   <w:footnote w:type="separator" w:id="-1">
     <w:p>
       <w:r>
@@ -455,7 +428,7 @@
 </file>
 
 <file path=word/header1.xml><?xml version="1.0" encoding="utf-8"?>
-<w:hdr xmlns:wpc="http://schemas.microsoft.com/office/word/2010/wordprocessingCanvas" xmlns:cx="http://schemas.microsoft.com/office/drawing/2014/chartex" xmlns:cx1="http://schemas.microsoft.com/office/drawing/2015/9/8/chartex" xmlns:cx2="http://schemas.microsoft.com/office/drawing/2015/10/21/chartex" xmlns:cx3="http://schemas.microsoft.com/office/drawing/2016/5/9/chartex" xmlns:cx4="http://schemas.microsoft.com/office/drawing/2016/5/10/chartex" xmlns:cx5="http://schemas.microsoft.com/office/drawing/2016/5/11/chartex" xmlns:cx6="http://schemas.microsoft.com/office/drawing/2016/5/12/chartex" xmlns:cx7="http://schemas.microsoft.com/office/drawing/2016/5/13/chartex" xmlns:cx8="http://schemas.microsoft.com/office/drawing/2016/5/14/chartex" xmlns:mc="http://schemas.openxmlformats.org/markup-compatibility/2006" xmlns:aink="http://schemas.microsoft.com/office/drawing/2016/ink" xmlns:am3d="http://schemas.microsoft.com/office/drawing/2017/model3d" xmlns:o="urn:schemas-microsoft-com:office:office" xmlns:r="http://schemas.openxmlformats.org/officeDocument/2006/relationships" xmlns:m="http://schemas.openxmlformats.org/officeDocument/2006/math" xmlns:v="urn:schemas-microsoft-com:vml" xmlns:wp14="http://schemas.microsoft.com/office/word/2010/wordprocessingDrawing" xmlns:wp="http://schemas.openxmlformats.org/drawingml/2006/wordprocessingDrawing" xmlns:w10="urn:schemas-microsoft-com:office:word" xmlns:w="http://schemas.openxmlformats.org/wordprocessingml/2006/main" xmlns:w14="http://schemas.microsoft.com/office/word/2010/wordml" xmlns:w15="http://schemas.microsoft.com/office/word/2012/wordml" xmlns:w16cex="http://schemas.microsoft.com/office/word/2018/wordml/cex" xmlns:w16cid="http://schemas.microsoft.com/office/word/2016/wordml/cid" xmlns:w16="http://schemas.microsoft.com/office/word/2018/wordml" xmlns:w16sdtdh="http://schemas.microsoft.com/office/word/2020/wordml/sdtdatahash" xmlns:w16se="http://schemas.microsoft.com/office/word/2015/wordml/symex" xmlns:wpg="http://schemas.microsoft.com/office/word/2010/wordprocessingGroup" xmlns:wpi="http://schemas.microsoft.com/office/word/2010/wordprocessingInk" xmlns:wne="http://schemas.microsoft.com/office/word/2006/wordml" xmlns:wps="http://schemas.microsoft.com/office/word/2010/wordprocessingShape" mc:Ignorable="w14 w15 w16se w16cid w16 w16cex w16sdtdh wp14">
+<w:hdr xmlns:wpc="http://schemas.microsoft.com/office/word/2010/wordprocessingCanvas" xmlns:cx="http://schemas.microsoft.com/office/drawing/2014/chartex" xmlns:cx1="http://schemas.microsoft.com/office/drawing/2015/9/8/chartex" xmlns:cx2="http://schemas.microsoft.com/office/drawing/2015/10/21/chartex" xmlns:cx3="http://schemas.microsoft.com/office/drawing/2016/5/9/chartex" xmlns:cx4="http://schemas.microsoft.com/office/drawing/2016/5/10/chartex" xmlns:cx5="http://schemas.microsoft.com/office/drawing/2016/5/11/chartex" xmlns:cx6="http://schemas.microsoft.com/office/drawing/2016/5/12/chartex" xmlns:cx7="http://schemas.microsoft.com/office/drawing/2016/5/13/chartex" xmlns:cx8="http://schemas.microsoft.com/office/drawing/2016/5/14/chartex" xmlns:mc="http://schemas.openxmlformats.org/markup-compatibility/2006" xmlns:aink="http://schemas.microsoft.com/office/drawing/2016/ink" xmlns:am3d="http://schemas.microsoft.com/office/drawing/2017/model3d" xmlns:o="urn:schemas-microsoft-com:office:office" xmlns:oel="http://schemas.microsoft.com/office/2019/extlst" xmlns:r="http://schemas.openxmlformats.org/officeDocument/2006/relationships" xmlns:m="http://schemas.openxmlformats.org/officeDocument/2006/math" xmlns:v="urn:schemas-microsoft-com:vml" xmlns:wp14="http://schemas.microsoft.com/office/word/2010/wordprocessingDrawing" xmlns:wp="http://schemas.openxmlformats.org/drawingml/2006/wordprocessingDrawing" xmlns:w10="urn:schemas-microsoft-com:office:word" xmlns:w="http://schemas.openxmlformats.org/wordprocessingml/2006/main" xmlns:w14="http://schemas.microsoft.com/office/word/2010/wordml" xmlns:w15="http://schemas.microsoft.com/office/word/2012/wordml" xmlns:w16cex="http://schemas.microsoft.com/office/word/2018/wordml/cex" xmlns:w16cid="http://schemas.microsoft.com/office/word/2016/wordml/cid" xmlns:w16="http://schemas.microsoft.com/office/word/2018/wordml" xmlns:w16du="http://schemas.microsoft.com/office/word/2023/wordml/word16du" xmlns:w16sdtdh="http://schemas.microsoft.com/office/word/2020/wordml/sdtdatahash" xmlns:w16sdtfl="http://schemas.microsoft.com/office/word/2024/wordml/sdtformatlock" xmlns:w16se="http://schemas.microsoft.com/office/word/2015/wordml/symex" xmlns:wpg="http://schemas.microsoft.com/office/word/2010/wordprocessingGroup" xmlns:wpi="http://schemas.microsoft.com/office/word/2010/wordprocessingInk" xmlns:wne="http://schemas.microsoft.com/office/word/2006/wordml" xmlns:wps="http://schemas.microsoft.com/office/word/2010/wordprocessingShape" mc:Ignorable="w14 w15 w16se w16cid w16 w16cex w16sdtdh w16sdtfl w16du wp14">
   <w:p>
     <w:pPr>
       <w:pStyle w:val="Cabealho"/>
@@ -574,7 +547,7 @@
 </file>
 
 <file path=word/numbering.xml><?xml version="1.0" encoding="utf-8"?>
-<w:numbering xmlns:wpc="http://schemas.microsoft.com/office/word/2010/wordprocessingCanvas" xmlns:cx="http://schemas.microsoft.com/office/drawing/2014/chartex" xmlns:cx1="http://schemas.microsoft.com/office/drawing/2015/9/8/chartex" xmlns:cx2="http://schemas.microsoft.com/office/drawing/2015/10/21/chartex" xmlns:cx3="http://schemas.microsoft.com/office/drawing/2016/5/9/chartex" xmlns:cx4="http://schemas.microsoft.com/office/drawing/2016/5/10/chartex" xmlns:cx5="http://schemas.microsoft.com/office/drawing/2016/5/11/chartex" xmlns:cx6="http://schemas.microsoft.com/office/drawing/2016/5/12/chartex" xmlns:cx7="http://schemas.microsoft.com/office/drawing/2016/5/13/chartex" xmlns:cx8="http://schemas.microsoft.com/office/drawing/2016/5/14/chartex" xmlns:mc="http://schemas.openxmlformats.org/markup-compatibility/2006" xmlns:aink="http://schemas.microsoft.com/office/drawing/2016/ink" xmlns:am3d="http://schemas.microsoft.com/office/drawing/2017/model3d" xmlns:o="urn:schemas-microsoft-com:office:office" xmlns:r="http://schemas.openxmlformats.org/officeDocument/2006/relationships" xmlns:m="http://schemas.openxmlformats.org/officeDocument/2006/math" xmlns:v="urn:schemas-microsoft-com:vml" xmlns:wp14="http://schemas.microsoft.com/office/word/2010/wordprocessingDrawing" xmlns:wp="http://schemas.openxmlformats.org/drawingml/2006/wordprocessingDrawing" xmlns:w10="urn:schemas-microsoft-com:office:word" xmlns:w="http://schemas.openxmlformats.org/wordprocessingml/2006/main" xmlns:w14="http://schemas.microsoft.com/office/word/2010/wordml" xmlns:w15="http://schemas.microsoft.com/office/word/2012/wordml" xmlns:w16cex="http://schemas.microsoft.com/office/word/2018/wordml/cex" xmlns:w16cid="http://schemas.microsoft.com/office/word/2016/wordml/cid" xmlns:w16="http://schemas.microsoft.com/office/word/2018/wordml" xmlns:w16sdtdh="http://schemas.microsoft.com/office/word/2020/wordml/sdtdatahash" xmlns:w16se="http://schemas.microsoft.com/office/word/2015/wordml/symex" xmlns:wpg="http://schemas.microsoft.com/office/word/2010/wordprocessingGroup" xmlns:wpi="http://schemas.microsoft.com/office/word/2010/wordprocessingInk" xmlns:wne="http://schemas.microsoft.com/office/word/2006/wordml" xmlns:wps="http://schemas.microsoft.com/office/word/2010/wordprocessingShape" mc:Ignorable="w14 w15 w16se w16cid w16 w16cex w16sdtdh wp14">
+<w:numbering xmlns:wpc="http://schemas.microsoft.com/office/word/2010/wordprocessingCanvas" xmlns:cx="http://schemas.microsoft.com/office/drawing/2014/chartex" xmlns:cx1="http://schemas.microsoft.com/office/drawing/2015/9/8/chartex" xmlns:cx2="http://schemas.microsoft.com/office/drawing/2015/10/21/chartex" xmlns:cx3="http://schemas.microsoft.com/office/drawing/2016/5/9/chartex" xmlns:cx4="http://schemas.microsoft.com/office/drawing/2016/5/10/chartex" xmlns:cx5="http://schemas.microsoft.com/office/drawing/2016/5/11/chartex" xmlns:cx6="http://schemas.microsoft.com/office/drawing/2016/5/12/chartex" xmlns:cx7="http://schemas.microsoft.com/office/drawing/2016/5/13/chartex" xmlns:cx8="http://schemas.microsoft.com/office/drawing/2016/5/14/chartex" xmlns:mc="http://schemas.openxmlformats.org/markup-compatibility/2006" xmlns:aink="http://schemas.microsoft.com/office/drawing/2016/ink" xmlns:am3d="http://schemas.microsoft.com/office/drawing/2017/model3d" xmlns:o="urn:schemas-microsoft-com:office:office" xmlns:oel="http://schemas.microsoft.com/office/2019/extlst" xmlns:r="http://schemas.openxmlformats.org/officeDocument/2006/relationships" xmlns:m="http://schemas.openxmlformats.org/officeDocument/2006/math" xmlns:v="urn:schemas-microsoft-com:vml" xmlns:wp14="http://schemas.microsoft.com/office/word/2010/wordprocessingDrawing" xmlns:wp="http://schemas.openxmlformats.org/drawingml/2006/wordprocessingDrawing" xmlns:w10="urn:schemas-microsoft-com:office:word" xmlns:w="http://schemas.openxmlformats.org/wordprocessingml/2006/main" xmlns:w14="http://schemas.microsoft.com/office/word/2010/wordml" xmlns:w15="http://schemas.microsoft.com/office/word/2012/wordml" xmlns:w16cex="http://schemas.microsoft.com/office/word/2018/wordml/cex" xmlns:w16cid="http://schemas.microsoft.com/office/word/2016/wordml/cid" xmlns:w16="http://schemas.microsoft.com/office/word/2018/wordml" xmlns:w16du="http://schemas.microsoft.com/office/word/2023/wordml/word16du" xmlns:w16sdtdh="http://schemas.microsoft.com/office/word/2020/wordml/sdtdatahash" xmlns:w16sdtfl="http://schemas.microsoft.com/office/word/2024/wordml/sdtformatlock" xmlns:w16se="http://schemas.microsoft.com/office/word/2015/wordml/symex" xmlns:wpg="http://schemas.microsoft.com/office/word/2010/wordprocessingGroup" xmlns:wpi="http://schemas.microsoft.com/office/word/2010/wordprocessingInk" xmlns:wne="http://schemas.microsoft.com/office/word/2006/wordml" xmlns:wps="http://schemas.microsoft.com/office/word/2010/wordprocessingShape" mc:Ignorable="w14 w15 w16se w16cid w16 w16cex w16sdtdh w16sdtfl w16du wp14">
   <w:abstractNum w:abstractNumId="0" w15:restartNumberingAfterBreak="0">
     <w:nsid w:val="07FA20CE"/>
     <w:multiLevelType w:val="hybridMultilevel"/>
@@ -1551,38 +1524,38 @@
       </w:pPr>
     </w:lvl>
   </w:abstractNum>
-  <w:num w:numId="1">
+  <w:num w:numId="1" w16cid:durableId="1276715108">
     <w:abstractNumId w:val="4"/>
   </w:num>
-  <w:num w:numId="2">
+  <w:num w:numId="2" w16cid:durableId="1137338156">
     <w:abstractNumId w:val="8"/>
   </w:num>
-  <w:num w:numId="3">
+  <w:num w:numId="3" w16cid:durableId="177895444">
     <w:abstractNumId w:val="3"/>
   </w:num>
-  <w:num w:numId="4">
+  <w:num w:numId="4" w16cid:durableId="1829980716">
     <w:abstractNumId w:val="1"/>
   </w:num>
-  <w:num w:numId="5">
+  <w:num w:numId="5" w16cid:durableId="2144275833">
     <w:abstractNumId w:val="7"/>
   </w:num>
-  <w:num w:numId="6">
+  <w:num w:numId="6" w16cid:durableId="1032463182">
     <w:abstractNumId w:val="6"/>
   </w:num>
-  <w:num w:numId="7">
+  <w:num w:numId="7" w16cid:durableId="1247421147">
     <w:abstractNumId w:val="0"/>
   </w:num>
-  <w:num w:numId="8">
+  <w:num w:numId="8" w16cid:durableId="1804300397">
     <w:abstractNumId w:val="2"/>
   </w:num>
-  <w:num w:numId="9">
+  <w:num w:numId="9" w16cid:durableId="1650786808">
     <w:abstractNumId w:val="5"/>
   </w:num>
 </w:numbering>
 </file>
 
 <file path=word/styles.xml><?xml version="1.0" encoding="utf-8"?>
-<w:styles xmlns:mc="http://schemas.openxmlformats.org/markup-compatibility/2006" xmlns:r="http://schemas.openxmlformats.org/officeDocument/2006/relationships" xmlns:w="http://schemas.openxmlformats.org/wordprocessingml/2006/main" xmlns:w14="http://schemas.microsoft.com/office/word/2010/wordml" xmlns:w15="http://schemas.microsoft.com/office/word/2012/wordml" xmlns:w16cex="http://schemas.microsoft.com/office/word/2018/wordml/cex" xmlns:w16cid="http://schemas.microsoft.com/office/word/2016/wordml/cid" xmlns:w16="http://schemas.microsoft.com/office/word/2018/wordml" xmlns:w16sdtdh="http://schemas.microsoft.com/office/word/2020/wordml/sdtdatahash" xmlns:w16se="http://schemas.microsoft.com/office/word/2015/wordml/symex" mc:Ignorable="w14 w15 w16se w16cid w16 w16cex w16sdtdh">
+<w:styles xmlns:mc="http://schemas.openxmlformats.org/markup-compatibility/2006" xmlns:r="http://schemas.openxmlformats.org/officeDocument/2006/relationships" xmlns:w="http://schemas.openxmlformats.org/wordprocessingml/2006/main" xmlns:w14="http://schemas.microsoft.com/office/word/2010/wordml" xmlns:w15="http://schemas.microsoft.com/office/word/2012/wordml" xmlns:w16cex="http://schemas.microsoft.com/office/word/2018/wordml/cex" xmlns:w16cid="http://schemas.microsoft.com/office/word/2016/wordml/cid" xmlns:w16="http://schemas.microsoft.com/office/word/2018/wordml" xmlns:w16du="http://schemas.microsoft.com/office/word/2023/wordml/word16du" xmlns:w16sdtdh="http://schemas.microsoft.com/office/word/2020/wordml/sdtdatahash" xmlns:w16sdtfl="http://schemas.microsoft.com/office/word/2024/wordml/sdtformatlock" xmlns:w16se="http://schemas.microsoft.com/office/word/2015/wordml/symex" mc:Ignorable="w14 w15 w16se w16cid w16 w16cex w16sdtdh w16sdtfl w16du">
   <w:docDefaults>
     <w:rPrDefault>
       <w:rPr>
@@ -1704,6 +1677,7 @@
     <w:lsdException w:name="HTML Sample" w:semiHidden="1" w:unhideWhenUsed="1"/>
     <w:lsdException w:name="HTML Typewriter" w:semiHidden="1" w:unhideWhenUsed="1"/>
     <w:lsdException w:name="HTML Variable" w:semiHidden="1" w:unhideWhenUsed="1"/>
+    <w:lsdException w:name="Normal Table" w:semiHidden="1" w:unhideWhenUsed="1"/>
     <w:lsdException w:name="annotation subject" w:semiHidden="1" w:unhideWhenUsed="1"/>
     <w:lsdException w:name="No List" w:semiHidden="1" w:unhideWhenUsed="1"/>
     <w:lsdException w:name="Outline List 1" w:semiHidden="1" w:unhideWhenUsed="1"/>
@@ -1746,8 +1720,11 @@
     <w:lsdException w:name="Table Contemporary" w:semiHidden="1" w:unhideWhenUsed="1"/>
     <w:lsdException w:name="Table Elegant" w:semiHidden="1" w:unhideWhenUsed="1"/>
     <w:lsdException w:name="Table Professional" w:semiHidden="1" w:unhideWhenUsed="1"/>
+    <w:lsdException w:name="Table Subtle 1" w:semiHidden="1" w:unhideWhenUsed="1"/>
     <w:lsdException w:name="Table Subtle 2" w:semiHidden="1" w:unhideWhenUsed="1"/>
     <w:lsdException w:name="Table Web 1" w:semiHidden="1" w:unhideWhenUsed="1"/>
+    <w:lsdException w:name="Table Web 2" w:semiHidden="1" w:unhideWhenUsed="1"/>
+    <w:lsdException w:name="Table Web 3" w:semiHidden="1" w:unhideWhenUsed="1"/>
     <w:lsdException w:name="Balloon Text" w:semiHidden="1" w:unhideWhenUsed="1"/>
     <w:lsdException w:name="Table Grid" w:uiPriority="0"/>
     <w:lsdException w:name="Table Theme" w:semiHidden="1" w:unhideWhenUsed="1"/>

</xml_diff>